<commit_message>
Expand course manual and assessment framework
</commit_message>
<xml_diff>
--- a/docs/attachments/entry-profile.docx
+++ b/docs/attachments/entry-profile.docx
@@ -545,12 +545,12 @@
         <w:pStyle w:val="Heading1"/>
       </w:pPr>
       <w:r>
-        <w:t>3. Обязательные входные дисциплины и навыки</w:t>
+        <w:t>3. Обязательные входные компетенции</w:t>
       </w:r>
     </w:p>
     <w:p>
       <w:r>
-        <w:t>Наименования дисциплин в конкретном учебном плане могут отличаться. Для допуска важен не факт изучения курса, а наличие проверяемых результатов обучения.</w:t>
+        <w:t>Коды ВК используются только внутри учебного проекта и не заменяют компетенции ОПОП. Они позволяют одинаково описать результаты предшествующих дисциплин и задания входной диагностики.</w:t>
       </w:r>
     </w:p>
     <w:tbl>
@@ -573,7 +573,7 @@
         </w:trPr>
         <w:tc>
           <w:tcPr>
-            <w:tcW w:type="dxa" w:w="1871"/>
+            <w:tcW w:type="dxa" w:w="1134"/>
             <w:shd w:fill="1F4E78"/>
             <w:tcMar>
               <w:top w:w="80" w:type="dxa"/>
@@ -592,15 +592,15 @@
                 <w:rFonts w:ascii="Times New Roman" w:hAnsi="Times New Roman"/>
                 <w:b/>
                 <w:color w:val="FFFFFF"/>
-                <w:sz w:val="15"/>
+                <w:sz w:val="16"/>
               </w:rPr>
-              <w:t>Дисциплина / область</w:t>
+              <w:t>Индикатор</w:t>
             </w:r>
           </w:p>
         </w:tc>
         <w:tc>
           <w:tcPr>
-            <w:tcW w:type="dxa" w:w="2835"/>
+            <w:tcW w:type="dxa" w:w="2551"/>
             <w:shd w:fill="1F4E78"/>
             <w:tcMar>
               <w:top w:w="80" w:type="dxa"/>
@@ -619,15 +619,15 @@
                 <w:rFonts w:ascii="Times New Roman" w:hAnsi="Times New Roman"/>
                 <w:b/>
                 <w:color w:val="FFFFFF"/>
-                <w:sz w:val="15"/>
+                <w:sz w:val="16"/>
               </w:rPr>
-              <w:t>Студент знает</w:t>
+              <w:t>Предшествующая дисциплина</w:t>
             </w:r>
           </w:p>
         </w:tc>
         <w:tc>
           <w:tcPr>
-            <w:tcW w:type="dxa" w:w="3515"/>
+            <w:tcW w:type="dxa" w:w="4989"/>
             <w:shd w:fill="1F4E78"/>
             <w:tcMar>
               <w:top w:w="80" w:type="dxa"/>
@@ -646,15 +646,15 @@
                 <w:rFonts w:ascii="Times New Roman" w:hAnsi="Times New Roman"/>
                 <w:b/>
                 <w:color w:val="FFFFFF"/>
-                <w:sz w:val="15"/>
+                <w:sz w:val="16"/>
               </w:rPr>
-              <w:t>Студент умеет</w:t>
+              <w:t>Проверяемое входное умение</w:t>
             </w:r>
           </w:p>
         </w:tc>
         <w:tc>
           <w:tcPr>
-            <w:tcW w:type="dxa" w:w="1247"/>
+            <w:tcW w:type="dxa" w:w="794"/>
             <w:shd w:fill="1F4E78"/>
             <w:tcMar>
               <w:top w:w="80" w:type="dxa"/>
@@ -673,9 +673,9 @@
                 <w:rFonts w:ascii="Times New Roman" w:hAnsi="Times New Roman"/>
                 <w:b/>
                 <w:color w:val="FFFFFF"/>
-                <w:sz w:val="15"/>
+                <w:sz w:val="16"/>
               </w:rPr>
-              <w:t>Статус</w:t>
+              <w:t>Уровень</w:t>
             </w:r>
           </w:p>
         </w:tc>
@@ -683,7 +683,7 @@
       <w:tr>
         <w:tc>
           <w:tcPr>
-            <w:tcW w:type="dxa" w:w="1871"/>
+            <w:tcW w:type="dxa" w:w="1134"/>
             <w:tcMar>
               <w:top w:w="80" w:type="dxa"/>
               <w:start w:w="90" w:type="dxa"/>
@@ -699,15 +699,15 @@
             <w:r>
               <w:rPr>
                 <w:rFonts w:ascii="Times New Roman" w:hAnsi="Times New Roman"/>
-                <w:sz w:val="15"/>
+                <w:sz w:val="16"/>
               </w:rPr>
-              <w:t>Математический анализ</w:t>
+              <w:t>ВК-1.1</w:t>
             </w:r>
           </w:p>
         </w:tc>
         <w:tc>
           <w:tcPr>
-            <w:tcW w:type="dxa" w:w="2835"/>
+            <w:tcW w:type="dxa" w:w="2551"/>
             <w:tcMar>
               <w:top w:w="80" w:type="dxa"/>
               <w:start w:w="90" w:type="dxa"/>
@@ -723,15 +723,15 @@
             <w:r>
               <w:rPr>
                 <w:rFonts w:ascii="Times New Roman" w:hAnsi="Times New Roman"/>
-                <w:sz w:val="15"/>
+                <w:sz w:val="16"/>
               </w:rPr>
-              <w:t>Функции одной и нескольких переменных; производная и частные производные; экстремумы; интеграл; представление о градиенте.</w:t>
+              <w:t>Математический анализ</w:t>
             </w:r>
           </w:p>
         </w:tc>
         <w:tc>
           <w:tcPr>
-            <w:tcW w:type="dxa" w:w="3515"/>
+            <w:tcW w:type="dxa" w:w="4989"/>
             <w:tcMar>
               <w:top w:w="80" w:type="dxa"/>
               <w:start w:w="90" w:type="dxa"/>
@@ -747,15 +747,15 @@
             <w:r>
               <w:rPr>
                 <w:rFonts w:ascii="Times New Roman" w:hAnsi="Times New Roman"/>
-                <w:sz w:val="15"/>
+                <w:sz w:val="16"/>
               </w:rPr>
-              <w:t>Интерпретировать скорость изменения показателя; понимать смысл функции потерь и направления оптимизации; читать математические обозначения в формулах моделей.</w:t>
+              <w:t>Интерпретирует функцию, производную, экстремум и градиент; связывает минимум функции с настройкой модели.</w:t>
             </w:r>
           </w:p>
         </w:tc>
         <w:tc>
           <w:tcPr>
-            <w:tcW w:type="dxa" w:w="1247"/>
+            <w:tcW w:type="dxa" w:w="794"/>
             <w:tcMar>
               <w:top w:w="80" w:type="dxa"/>
               <w:start w:w="90" w:type="dxa"/>
@@ -771,9 +771,9 @@
             <w:r>
               <w:rPr>
                 <w:rFonts w:ascii="Times New Roman" w:hAnsi="Times New Roman"/>
-                <w:sz w:val="15"/>
+                <w:sz w:val="16"/>
               </w:rPr>
-              <w:t>Обязательно</w:t>
+              <w:t>Б</w:t>
             </w:r>
           </w:p>
         </w:tc>
@@ -781,7 +781,7 @@
       <w:tr>
         <w:tc>
           <w:tcPr>
-            <w:tcW w:type="dxa" w:w="1871"/>
+            <w:tcW w:type="dxa" w:w="1134"/>
             <w:tcMar>
               <w:top w:w="80" w:type="dxa"/>
               <w:start w:w="90" w:type="dxa"/>
@@ -798,15 +798,15 @@
             <w:r>
               <w:rPr>
                 <w:rFonts w:ascii="Times New Roman" w:hAnsi="Times New Roman"/>
-                <w:sz w:val="15"/>
+                <w:sz w:val="16"/>
               </w:rPr>
-              <w:t>Линейная алгебра и аналитическая геометрия</w:t>
+              <w:t>ВК-1.2</w:t>
             </w:r>
           </w:p>
         </w:tc>
         <w:tc>
           <w:tcPr>
-            <w:tcW w:type="dxa" w:w="2835"/>
+            <w:tcW w:type="dxa" w:w="2551"/>
             <w:tcMar>
               <w:top w:w="80" w:type="dxa"/>
               <w:start w:w="90" w:type="dxa"/>
@@ -823,15 +823,15 @@
             <w:r>
               <w:rPr>
                 <w:rFonts w:ascii="Times New Roman" w:hAnsi="Times New Roman"/>
-                <w:sz w:val="15"/>
+                <w:sz w:val="16"/>
               </w:rPr>
-              <w:t>Векторы и матрицы; линейные преобразования; системы линейных уравнений; скалярное произведение; базовое представление о собственных значениях.</w:t>
+              <w:t>Линейная алгебра</w:t>
             </w:r>
           </w:p>
         </w:tc>
         <w:tc>
           <w:tcPr>
-            <w:tcW w:type="dxa" w:w="3515"/>
+            <w:tcW w:type="dxa" w:w="4989"/>
             <w:tcMar>
               <w:top w:w="80" w:type="dxa"/>
               <w:start w:w="90" w:type="dxa"/>
@@ -848,15 +848,15 @@
             <w:r>
               <w:rPr>
                 <w:rFonts w:ascii="Times New Roman" w:hAnsi="Times New Roman"/>
-                <w:sz w:val="15"/>
+                <w:sz w:val="16"/>
               </w:rPr>
-              <w:t>Выполнять матричные операции; проверять размерности; интерпретировать данные как матрицу объектов и признаков; понимать геометрический смысл расстояния и проекции.</w:t>
+              <w:t>Выполняет базовые операции с векторами и матрицами, использует норму, расстояние и скалярное произведение.</w:t>
             </w:r>
           </w:p>
         </w:tc>
         <w:tc>
           <w:tcPr>
-            <w:tcW w:type="dxa" w:w="1247"/>
+            <w:tcW w:type="dxa" w:w="794"/>
             <w:tcMar>
               <w:top w:w="80" w:type="dxa"/>
               <w:start w:w="90" w:type="dxa"/>
@@ -873,9 +873,9 @@
             <w:r>
               <w:rPr>
                 <w:rFonts w:ascii="Times New Roman" w:hAnsi="Times New Roman"/>
-                <w:sz w:val="15"/>
+                <w:sz w:val="16"/>
               </w:rPr>
-              <w:t>Обязательно</w:t>
+              <w:t>Б</w:t>
             </w:r>
           </w:p>
         </w:tc>
@@ -883,7 +883,7 @@
       <w:tr>
         <w:tc>
           <w:tcPr>
-            <w:tcW w:type="dxa" w:w="1871"/>
+            <w:tcW w:type="dxa" w:w="1134"/>
             <w:tcMar>
               <w:top w:w="80" w:type="dxa"/>
               <w:start w:w="90" w:type="dxa"/>
@@ -899,15 +899,15 @@
             <w:r>
               <w:rPr>
                 <w:rFonts w:ascii="Times New Roman" w:hAnsi="Times New Roman"/>
-                <w:sz w:val="15"/>
+                <w:sz w:val="16"/>
               </w:rPr>
-              <w:t>Теория вероятностей и математическая статистика</w:t>
+              <w:t>ВК-2.1</w:t>
             </w:r>
           </w:p>
         </w:tc>
         <w:tc>
           <w:tcPr>
-            <w:tcW w:type="dxa" w:w="2835"/>
+            <w:tcW w:type="dxa" w:w="2551"/>
             <w:tcMar>
               <w:top w:w="80" w:type="dxa"/>
               <w:start w:w="90" w:type="dxa"/>
@@ -923,15 +923,15 @@
             <w:r>
               <w:rPr>
                 <w:rFonts w:ascii="Times New Roman" w:hAnsi="Times New Roman"/>
-                <w:sz w:val="15"/>
+                <w:sz w:val="16"/>
               </w:rPr>
-              <w:t>Случайная величина; распределение; среднее, медиана, дисперсия; выборка; корреляция; доверительный интервал; статистическая гипотеза.</w:t>
+              <w:t>Теория вероятностей и математическая статистика</w:t>
             </w:r>
           </w:p>
         </w:tc>
         <w:tc>
           <w:tcPr>
-            <w:tcW w:type="dxa" w:w="3515"/>
+            <w:tcW w:type="dxa" w:w="4989"/>
             <w:tcMar>
               <w:top w:w="80" w:type="dxa"/>
               <w:start w:w="90" w:type="dxa"/>
@@ -947,15 +947,15 @@
             <w:r>
               <w:rPr>
                 <w:rFonts w:ascii="Times New Roman" w:hAnsi="Times New Roman"/>
-                <w:sz w:val="15"/>
+                <w:sz w:val="16"/>
               </w:rPr>
-              <w:t>Рассчитывать и интерпретировать описательные статистики; различать совокупность и выборку; формулировать нулевую и альтернативную гипотезы; осторожно интерпретировать корреляцию.</w:t>
+              <w:t>Рассчитывает и интерпретирует среднее, медиану, дисперсию, квантили и характеристики выборки.</w:t>
             </w:r>
           </w:p>
         </w:tc>
         <w:tc>
           <w:tcPr>
-            <w:tcW w:type="dxa" w:w="1247"/>
+            <w:tcW w:type="dxa" w:w="794"/>
             <w:tcMar>
               <w:top w:w="80" w:type="dxa"/>
               <w:start w:w="90" w:type="dxa"/>
@@ -971,9 +971,9 @@
             <w:r>
               <w:rPr>
                 <w:rFonts w:ascii="Times New Roman" w:hAnsi="Times New Roman"/>
-                <w:sz w:val="15"/>
+                <w:sz w:val="16"/>
               </w:rPr>
-              <w:t>Обязательно</w:t>
+              <w:t>Б</w:t>
             </w:r>
           </w:p>
         </w:tc>
@@ -981,7 +981,7 @@
       <w:tr>
         <w:tc>
           <w:tcPr>
-            <w:tcW w:type="dxa" w:w="1871"/>
+            <w:tcW w:type="dxa" w:w="1134"/>
             <w:tcMar>
               <w:top w:w="80" w:type="dxa"/>
               <w:start w:w="90" w:type="dxa"/>
@@ -998,15 +998,15 @@
             <w:r>
               <w:rPr>
                 <w:rFonts w:ascii="Times New Roman" w:hAnsi="Times New Roman"/>
-                <w:sz w:val="15"/>
+                <w:sz w:val="16"/>
               </w:rPr>
-              <w:t>Основы программирования / Python</w:t>
+              <w:t>ВК-2.2</w:t>
             </w:r>
           </w:p>
         </w:tc>
         <w:tc>
           <w:tcPr>
-            <w:tcW w:type="dxa" w:w="2835"/>
+            <w:tcW w:type="dxa" w:w="2551"/>
             <w:tcMar>
               <w:top w:w="80" w:type="dxa"/>
               <w:start w:w="90" w:type="dxa"/>
@@ -1023,15 +1023,15 @@
             <w:r>
               <w:rPr>
                 <w:rFonts w:ascii="Times New Roman" w:hAnsi="Times New Roman"/>
-                <w:sz w:val="15"/>
+                <w:sz w:val="16"/>
               </w:rPr>
-              <w:t>Типы данных; условия и циклы; функции; коллекции; модули; чтение и запись файлов; обработка исключений.</w:t>
+              <w:t>Теория вероятностей и математическая статистика</w:t>
             </w:r>
           </w:p>
         </w:tc>
         <w:tc>
           <w:tcPr>
-            <w:tcW w:type="dxa" w:w="3515"/>
+            <w:tcW w:type="dxa" w:w="4989"/>
             <w:tcMar>
               <w:top w:w="80" w:type="dxa"/>
               <w:start w:w="90" w:type="dxa"/>
@@ -1048,15 +1048,15 @@
             <w:r>
               <w:rPr>
                 <w:rFonts w:ascii="Times New Roman" w:hAnsi="Times New Roman"/>
-                <w:sz w:val="15"/>
+                <w:sz w:val="16"/>
               </w:rPr>
-              <w:t>Написать и отладить небольшой скрипт; разбить решение на функции; подключить библиотеку; прочитать CSV/JSON; понять сообщение об ошибке.</w:t>
+              <w:t>Различает вероятность, корреляцию, доверительный интервал и результат проверки гипотезы; не подменяет связь причинностью.</w:t>
             </w:r>
           </w:p>
         </w:tc>
         <w:tc>
           <w:tcPr>
-            <w:tcW w:type="dxa" w:w="1247"/>
+            <w:tcW w:type="dxa" w:w="794"/>
             <w:tcMar>
               <w:top w:w="80" w:type="dxa"/>
               <w:start w:w="90" w:type="dxa"/>
@@ -1073,9 +1073,9 @@
             <w:r>
               <w:rPr>
                 <w:rFonts w:ascii="Times New Roman" w:hAnsi="Times New Roman"/>
-                <w:sz w:val="15"/>
+                <w:sz w:val="16"/>
               </w:rPr>
-              <w:t>Обязательно</w:t>
+              <w:t>Б</w:t>
             </w:r>
           </w:p>
         </w:tc>
@@ -1083,7 +1083,7 @@
       <w:tr>
         <w:tc>
           <w:tcPr>
-            <w:tcW w:type="dxa" w:w="1871"/>
+            <w:tcW w:type="dxa" w:w="1134"/>
             <w:tcMar>
               <w:top w:w="80" w:type="dxa"/>
               <w:start w:w="90" w:type="dxa"/>
@@ -1099,15 +1099,15 @@
             <w:r>
               <w:rPr>
                 <w:rFonts w:ascii="Times New Roman" w:hAnsi="Times New Roman"/>
-                <w:sz w:val="15"/>
+                <w:sz w:val="16"/>
               </w:rPr>
-              <w:t>Основы технологий обработки данных</w:t>
+              <w:t>ВК-3.1</w:t>
             </w:r>
           </w:p>
         </w:tc>
         <w:tc>
           <w:tcPr>
-            <w:tcW w:type="dxa" w:w="2835"/>
+            <w:tcW w:type="dxa" w:w="2551"/>
             <w:tcMar>
               <w:top w:w="80" w:type="dxa"/>
               <w:start w:w="90" w:type="dxa"/>
@@ -1123,15 +1123,15 @@
             <w:r>
               <w:rPr>
                 <w:rFonts w:ascii="Times New Roman" w:hAnsi="Times New Roman"/>
-                <w:sz w:val="15"/>
+                <w:sz w:val="16"/>
               </w:rPr>
-              <w:t>Жизненный цикл данных; структурированные и неструктурированные данные; форматы CSV, JSON, XLSX; операции очистки и преобразования; понятия ETL/ELT и качества данных.</w:t>
+              <w:t>Основы программирования / Python</w:t>
             </w:r>
           </w:p>
         </w:tc>
         <w:tc>
           <w:tcPr>
-            <w:tcW w:type="dxa" w:w="3515"/>
+            <w:tcW w:type="dxa" w:w="4989"/>
             <w:tcMar>
               <w:top w:w="80" w:type="dxa"/>
               <w:start w:w="90" w:type="dxa"/>
@@ -1147,15 +1147,15 @@
             <w:r>
               <w:rPr>
                 <w:rFonts w:ascii="Times New Roman" w:hAnsi="Times New Roman"/>
-                <w:sz w:val="15"/>
+                <w:sz w:val="16"/>
               </w:rPr>
-              <w:t>Выбрать подходящий формат; выявить пропуски, дубликаты и несоответствия типов; описать последовательность получения и преобразования данных.</w:t>
+              <w:t>Пишет функции, использует коллекции, условия, циклы, модули и файловый ввод-вывод; читает сообщения об ошибках.</w:t>
             </w:r>
           </w:p>
         </w:tc>
         <w:tc>
           <w:tcPr>
-            <w:tcW w:type="dxa" w:w="1247"/>
+            <w:tcW w:type="dxa" w:w="794"/>
             <w:tcMar>
               <w:top w:w="80" w:type="dxa"/>
               <w:start w:w="90" w:type="dxa"/>
@@ -1171,9 +1171,9 @@
             <w:r>
               <w:rPr>
                 <w:rFonts w:ascii="Times New Roman" w:hAnsi="Times New Roman"/>
-                <w:sz w:val="15"/>
+                <w:sz w:val="16"/>
               </w:rPr>
-              <w:t>Обязательно</w:t>
+              <w:t>Б</w:t>
             </w:r>
           </w:p>
         </w:tc>
@@ -1181,7 +1181,7 @@
       <w:tr>
         <w:tc>
           <w:tcPr>
-            <w:tcW w:type="dxa" w:w="1871"/>
+            <w:tcW w:type="dxa" w:w="1134"/>
             <w:tcMar>
               <w:top w:w="80" w:type="dxa"/>
               <w:start w:w="90" w:type="dxa"/>
@@ -1198,15 +1198,15 @@
             <w:r>
               <w:rPr>
                 <w:rFonts w:ascii="Times New Roman" w:hAnsi="Times New Roman"/>
-                <w:sz w:val="15"/>
+                <w:sz w:val="16"/>
               </w:rPr>
-              <w:t>Базы данных</w:t>
+              <w:t>ВК-3.2</w:t>
             </w:r>
           </w:p>
         </w:tc>
         <w:tc>
           <w:tcPr>
-            <w:tcW w:type="dxa" w:w="2835"/>
+            <w:tcW w:type="dxa" w:w="2551"/>
             <w:tcMar>
               <w:top w:w="80" w:type="dxa"/>
               <w:start w:w="90" w:type="dxa"/>
@@ -1223,15 +1223,15 @@
             <w:r>
               <w:rPr>
                 <w:rFonts w:ascii="Times New Roman" w:hAnsi="Times New Roman"/>
-                <w:sz w:val="15"/>
+                <w:sz w:val="16"/>
               </w:rPr>
-              <w:t>Таблица, строка, атрибут, ключ, связь; нормализация на базовом уровне; SELECT, WHERE, JOIN, GROUP BY, агрегатные функции.</w:t>
+              <w:t>Основы программирования / Python</w:t>
             </w:r>
           </w:p>
         </w:tc>
         <w:tc>
           <w:tcPr>
-            <w:tcW w:type="dxa" w:w="3515"/>
+            <w:tcW w:type="dxa" w:w="4989"/>
             <w:tcMar>
               <w:top w:w="80" w:type="dxa"/>
               <w:start w:w="90" w:type="dxa"/>
@@ -1248,15 +1248,15 @@
             <w:r>
               <w:rPr>
                 <w:rFonts w:ascii="Times New Roman" w:hAnsi="Times New Roman"/>
-                <w:sz w:val="15"/>
+                <w:sz w:val="16"/>
               </w:rPr>
-              <w:t>Получить аналитическую выборку из нескольких таблиц; проверить гранулярность данных; не допустить неконтролируемого размножения строк при соединении.</w:t>
+              <w:t>Работает в ноутбуке и виртуальном окружении, выполняет базовые операции NumPy/pandas и повторно запускает код с начала.</w:t>
             </w:r>
           </w:p>
         </w:tc>
         <w:tc>
           <w:tcPr>
-            <w:tcW w:type="dxa" w:w="1247"/>
+            <w:tcW w:type="dxa" w:w="794"/>
             <w:tcMar>
               <w:top w:w="80" w:type="dxa"/>
               <w:start w:w="90" w:type="dxa"/>
@@ -1273,9 +1273,9 @@
             <w:r>
               <w:rPr>
                 <w:rFonts w:ascii="Times New Roman" w:hAnsi="Times New Roman"/>
-                <w:sz w:val="15"/>
+                <w:sz w:val="16"/>
               </w:rPr>
-              <w:t>Желательно</w:t>
+              <w:t>Б</w:t>
             </w:r>
           </w:p>
         </w:tc>
@@ -1283,7 +1283,7 @@
       <w:tr>
         <w:tc>
           <w:tcPr>
-            <w:tcW w:type="dxa" w:w="1871"/>
+            <w:tcW w:type="dxa" w:w="1134"/>
             <w:tcMar>
               <w:top w:w="80" w:type="dxa"/>
               <w:start w:w="90" w:type="dxa"/>
@@ -1299,15 +1299,15 @@
             <w:r>
               <w:rPr>
                 <w:rFonts w:ascii="Times New Roman" w:hAnsi="Times New Roman"/>
-                <w:sz w:val="15"/>
+                <w:sz w:val="16"/>
               </w:rPr>
-              <w:t>Алгоритмы и структуры данных</w:t>
+              <w:t>ВК-4.1</w:t>
             </w:r>
           </w:p>
         </w:tc>
         <w:tc>
           <w:tcPr>
-            <w:tcW w:type="dxa" w:w="2835"/>
+            <w:tcW w:type="dxa" w:w="2551"/>
             <w:tcMar>
               <w:top w:w="80" w:type="dxa"/>
               <w:start w:w="90" w:type="dxa"/>
@@ -1323,15 +1323,15 @@
             <w:r>
               <w:rPr>
                 <w:rFonts w:ascii="Times New Roman" w:hAnsi="Times New Roman"/>
-                <w:sz w:val="15"/>
+                <w:sz w:val="16"/>
               </w:rPr>
-              <w:t>Списки, словари, множества; последовательный поиск; сортировка; общее представление о вычислительной сложности.</w:t>
+              <w:t>Основы технологий обработки данных</w:t>
             </w:r>
           </w:p>
         </w:tc>
         <w:tc>
           <w:tcPr>
-            <w:tcW w:type="dxa" w:w="3515"/>
+            <w:tcW w:type="dxa" w:w="4989"/>
             <w:tcMar>
               <w:top w:w="80" w:type="dxa"/>
               <w:start w:w="90" w:type="dxa"/>
@@ -1347,15 +1347,15 @@
             <w:r>
               <w:rPr>
                 <w:rFonts w:ascii="Times New Roman" w:hAnsi="Times New Roman"/>
-                <w:sz w:val="15"/>
+                <w:sz w:val="16"/>
               </w:rPr>
-              <w:t>Выбирать структуру данных под задачу; замечать явно неэффективные циклы и заменять их векторными либо библиотечными операциями.</w:t>
+              <w:t>Различает типы, форматы и гранулярность; фильтрует, объединяет, агрегирует и проверяет пропуски.</w:t>
             </w:r>
           </w:p>
         </w:tc>
         <w:tc>
           <w:tcPr>
-            <w:tcW w:type="dxa" w:w="1247"/>
+            <w:tcW w:type="dxa" w:w="794"/>
             <w:tcMar>
               <w:top w:w="80" w:type="dxa"/>
               <w:start w:w="90" w:type="dxa"/>
@@ -1371,9 +1371,9 @@
             <w:r>
               <w:rPr>
                 <w:rFonts w:ascii="Times New Roman" w:hAnsi="Times New Roman"/>
-                <w:sz w:val="15"/>
+                <w:sz w:val="16"/>
               </w:rPr>
-              <w:t>Желательно</w:t>
+              <w:t>Б</w:t>
             </w:r>
           </w:p>
         </w:tc>
@@ -1381,7 +1381,7 @@
       <w:tr>
         <w:tc>
           <w:tcPr>
-            <w:tcW w:type="dxa" w:w="1871"/>
+            <w:tcW w:type="dxa" w:w="1134"/>
             <w:tcMar>
               <w:top w:w="80" w:type="dxa"/>
               <w:start w:w="90" w:type="dxa"/>
@@ -1398,15 +1398,15 @@
             <w:r>
               <w:rPr>
                 <w:rFonts w:ascii="Times New Roman" w:hAnsi="Times New Roman"/>
-                <w:sz w:val="15"/>
+                <w:sz w:val="16"/>
               </w:rPr>
-              <w:t>Основы предметной области</w:t>
+              <w:t>ВК-4.2</w:t>
             </w:r>
           </w:p>
         </w:tc>
         <w:tc>
           <w:tcPr>
-            <w:tcW w:type="dxa" w:w="2835"/>
+            <w:tcW w:type="dxa" w:w="2551"/>
             <w:tcMar>
               <w:top w:w="80" w:type="dxa"/>
               <w:start w:w="90" w:type="dxa"/>
@@ -1423,15 +1423,15 @@
             <w:r>
               <w:rPr>
                 <w:rFonts w:ascii="Times New Roman" w:hAnsi="Times New Roman"/>
-                <w:sz w:val="15"/>
+                <w:sz w:val="16"/>
               </w:rPr>
-              <w:t>Термины и типовые показатели той области, на данных которой выполняется проект.</w:t>
+              <w:t>Базы данных и технологии обработки данных</w:t>
             </w:r>
           </w:p>
         </w:tc>
         <w:tc>
           <w:tcPr>
-            <w:tcW w:type="dxa" w:w="3515"/>
+            <w:tcW w:type="dxa" w:w="4989"/>
             <w:tcMar>
               <w:top w:w="80" w:type="dxa"/>
               <w:start w:w="90" w:type="dxa"/>
@@ -1448,15 +1448,15 @@
             <w:r>
               <w:rPr>
                 <w:rFonts w:ascii="Times New Roman" w:hAnsi="Times New Roman"/>
-                <w:sz w:val="15"/>
+                <w:sz w:val="16"/>
               </w:rPr>
-              <w:t>Объяснять смысл показателей, отличать техническую зависимость от содержательно значимой, обсуждать результат с предметным специалистом.</w:t>
+              <w:t>Составляет простой запрос с SELECT, JOIN, GROUP BY и описывает источник и последовательность преобразований.</w:t>
             </w:r>
           </w:p>
         </w:tc>
         <w:tc>
           <w:tcPr>
-            <w:tcW w:type="dxa" w:w="1247"/>
+            <w:tcW w:type="dxa" w:w="794"/>
             <w:tcMar>
               <w:top w:w="80" w:type="dxa"/>
               <w:start w:w="90" w:type="dxa"/>
@@ -1473,9 +1473,9 @@
             <w:r>
               <w:rPr>
                 <w:rFonts w:ascii="Times New Roman" w:hAnsi="Times New Roman"/>
-                <w:sz w:val="15"/>
+                <w:sz w:val="16"/>
               </w:rPr>
-              <w:t>Обязательно для проекта</w:t>
+              <w:t>Б</w:t>
             </w:r>
           </w:p>
         </w:tc>
@@ -2062,7 +2062,7 @@
     </w:p>
     <w:p>
       <w:r>
-        <w:t>Диагностика проводится в первую неделю, занимает 60–90 минут и не влияет на итоговую оценку. Её результат используется для назначения выравнивающих материалов.</w:t>
+        <w:t>Диагностика проводится в первую неделю, занимает 60 минут и не влияет на итоговую оценку. Каждый индикатор оценивается отдельно по шкале 0–2.</w:t>
       </w:r>
     </w:p>
     <w:tbl>
@@ -2074,10 +2074,9 @@
         <w:tblLook w:firstColumn="1" w:firstRow="1" w:lastColumn="0" w:lastRow="0" w:noHBand="0" w:noVBand="1" w:val="04A0"/>
       </w:tblPr>
       <w:tblGrid>
-        <w:gridCol w:w="2507"/>
-        <w:gridCol w:w="2507"/>
-        <w:gridCol w:w="2507"/>
-        <w:gridCol w:w="2507"/>
+        <w:gridCol w:w="3343"/>
+        <w:gridCol w:w="3343"/>
+        <w:gridCol w:w="3343"/>
       </w:tblGrid>
       <w:tr>
         <w:trPr>
@@ -2085,7 +2084,7 @@
         </w:trPr>
         <w:tc>
           <w:tcPr>
-            <w:tcW w:type="dxa" w:w="567"/>
+            <w:tcW w:type="dxa" w:w="1247"/>
             <w:shd w:fill="1F4E78"/>
             <w:tcMar>
               <w:top w:w="80" w:type="dxa"/>
@@ -2106,13 +2105,13 @@
                 <w:color w:val="FFFFFF"/>
                 <w:sz w:val="17"/>
               </w:rPr>
-              <w:t>№</w:t>
+              <w:t>Индикатор</w:t>
             </w:r>
           </w:p>
         </w:tc>
         <w:tc>
           <w:tcPr>
-            <w:tcW w:type="dxa" w:w="2041"/>
+            <w:tcW w:type="dxa" w:w="7143"/>
             <w:shd w:fill="1F4E78"/>
             <w:tcMar>
               <w:top w:w="80" w:type="dxa"/>
@@ -2133,13 +2132,13 @@
                 <w:color w:val="FFFFFF"/>
                 <w:sz w:val="17"/>
               </w:rPr>
-              <w:t>Область</w:t>
+              <w:t>Диагностическое действие</w:t>
             </w:r>
           </w:p>
         </w:tc>
         <w:tc>
           <w:tcPr>
-            <w:tcW w:type="dxa" w:w="5896"/>
+            <w:tcW w:type="dxa" w:w="1077"/>
             <w:shd w:fill="1F4E78"/>
             <w:tcMar>
               <w:top w:w="80" w:type="dxa"/>
@@ -2160,34 +2159,7 @@
                 <w:color w:val="FFFFFF"/>
                 <w:sz w:val="17"/>
               </w:rPr>
-              <w:t>Пример проверяемого действия</w:t>
-            </w:r>
-          </w:p>
-        </w:tc>
-        <w:tc>
-          <w:tcPr>
-            <w:tcW w:type="dxa" w:w="964"/>
-            <w:shd w:fill="1F4E78"/>
-            <w:tcMar>
-              <w:top w:w="80" w:type="dxa"/>
-              <w:start w:w="90" w:type="dxa"/>
-              <w:bottom w:w="80" w:type="dxa"/>
-              <w:end w:w="90" w:type="dxa"/>
-            </w:tcMar>
-            <w:vAlign w:val="center"/>
-          </w:tcPr>
-          <w:p>
-            <w:pPr>
-              <w:jc w:val="center"/>
-            </w:pPr>
-            <w:r>
-              <w:rPr>
-                <w:rFonts w:ascii="Times New Roman" w:hAnsi="Times New Roman"/>
-                <w:b/>
-                <w:color w:val="FFFFFF"/>
-                <w:sz w:val="17"/>
-              </w:rPr>
-              <w:t>Баллы</w:t>
+              <w:t>Результат</w:t>
             </w:r>
           </w:p>
         </w:tc>
@@ -2195,7 +2167,7 @@
       <w:tr>
         <w:tc>
           <w:tcPr>
-            <w:tcW w:type="dxa" w:w="567"/>
+            <w:tcW w:type="dxa" w:w="1247"/>
             <w:tcMar>
               <w:top w:w="80" w:type="dxa"/>
               <w:start w:w="90" w:type="dxa"/>
@@ -2213,13 +2185,13 @@
                 <w:rFonts w:ascii="Times New Roman" w:hAnsi="Times New Roman"/>
                 <w:sz w:val="17"/>
               </w:rPr>
-              <w:t>1</w:t>
+              <w:t>ВК-1.1</w:t>
             </w:r>
           </w:p>
         </w:tc>
         <w:tc>
           <w:tcPr>
-            <w:tcW w:type="dxa" w:w="2041"/>
+            <w:tcW w:type="dxa" w:w="7143"/>
             <w:tcMar>
               <w:top w:w="80" w:type="dxa"/>
               <w:start w:w="90" w:type="dxa"/>
@@ -2237,13 +2209,13 @@
                 <w:rFonts w:ascii="Times New Roman" w:hAnsi="Times New Roman"/>
                 <w:sz w:val="17"/>
               </w:rPr>
-              <w:t>Математическая интерпретация</w:t>
+              <w:t>Найти минимум простой функции и объяснить смысл функции потерь</w:t>
             </w:r>
           </w:p>
         </w:tc>
         <w:tc>
           <w:tcPr>
-            <w:tcW w:type="dxa" w:w="5896"/>
+            <w:tcW w:type="dxa" w:w="1077"/>
             <w:tcMar>
               <w:top w:w="80" w:type="dxa"/>
               <w:start w:w="90" w:type="dxa"/>
@@ -2261,31 +2233,7 @@
                 <w:rFonts w:ascii="Times New Roman" w:hAnsi="Times New Roman"/>
                 <w:sz w:val="17"/>
               </w:rPr>
-              <w:t>Объяснить смысл производной показателя и градиента функции двух переменных</w:t>
-            </w:r>
-          </w:p>
-        </w:tc>
-        <w:tc>
-          <w:tcPr>
-            <w:tcW w:type="dxa" w:w="964"/>
-            <w:tcMar>
-              <w:top w:w="80" w:type="dxa"/>
-              <w:start w:w="90" w:type="dxa"/>
-              <w:bottom w:w="80" w:type="dxa"/>
-              <w:end w:w="90" w:type="dxa"/>
-            </w:tcMar>
-            <w:vAlign w:val="center"/>
-          </w:tcPr>
-          <w:p>
-            <w:pPr>
-              <w:spacing w:after="0"/>
-            </w:pPr>
-            <w:r>
-              <w:rPr>
-                <w:rFonts w:ascii="Times New Roman" w:hAnsi="Times New Roman"/>
-                <w:sz w:val="17"/>
-              </w:rPr>
-              <w:t>10</w:t>
+              <w:t>0–2</w:t>
             </w:r>
           </w:p>
         </w:tc>
@@ -2293,7 +2241,7 @@
       <w:tr>
         <w:tc>
           <w:tcPr>
-            <w:tcW w:type="dxa" w:w="567"/>
+            <w:tcW w:type="dxa" w:w="1247"/>
             <w:tcMar>
               <w:top w:w="80" w:type="dxa"/>
               <w:start w:w="90" w:type="dxa"/>
@@ -2312,13 +2260,13 @@
                 <w:rFonts w:ascii="Times New Roman" w:hAnsi="Times New Roman"/>
                 <w:sz w:val="17"/>
               </w:rPr>
-              <w:t>2</w:t>
+              <w:t>ВК-1.2</w:t>
             </w:r>
           </w:p>
         </w:tc>
         <w:tc>
           <w:tcPr>
-            <w:tcW w:type="dxa" w:w="2041"/>
+            <w:tcW w:type="dxa" w:w="7143"/>
             <w:tcMar>
               <w:top w:w="80" w:type="dxa"/>
               <w:start w:w="90" w:type="dxa"/>
@@ -2337,13 +2285,13 @@
                 <w:rFonts w:ascii="Times New Roman" w:hAnsi="Times New Roman"/>
                 <w:sz w:val="17"/>
               </w:rPr>
-              <w:t>Линейная алгебра</w:t>
+              <w:t>Рассчитать расстояние между векторами и объяснить влияние масштаба</w:t>
             </w:r>
           </w:p>
         </w:tc>
         <w:tc>
           <w:tcPr>
-            <w:tcW w:type="dxa" w:w="5896"/>
+            <w:tcW w:type="dxa" w:w="1077"/>
             <w:tcMar>
               <w:top w:w="80" w:type="dxa"/>
               <w:start w:w="90" w:type="dxa"/>
@@ -2362,13 +2310,89 @@
                 <w:rFonts w:ascii="Times New Roman" w:hAnsi="Times New Roman"/>
                 <w:sz w:val="17"/>
               </w:rPr>
-              <w:t>Определить допустимость матричной операции и размер результата</w:t>
+              <w:t>0–2</w:t>
+            </w:r>
+          </w:p>
+        </w:tc>
+      </w:tr>
+      <w:tr>
+        <w:tc>
+          <w:tcPr>
+            <w:tcW w:type="dxa" w:w="1247"/>
+            <w:tcMar>
+              <w:top w:w="80" w:type="dxa"/>
+              <w:start w:w="90" w:type="dxa"/>
+              <w:bottom w:w="80" w:type="dxa"/>
+              <w:end w:w="90" w:type="dxa"/>
+            </w:tcMar>
+            <w:vAlign w:val="center"/>
+          </w:tcPr>
+          <w:p>
+            <w:pPr>
+              <w:spacing w:after="0"/>
+            </w:pPr>
+            <w:r>
+              <w:rPr>
+                <w:rFonts w:ascii="Times New Roman" w:hAnsi="Times New Roman"/>
+                <w:sz w:val="17"/>
+              </w:rPr>
+              <w:t>ВК-2.1</w:t>
             </w:r>
           </w:p>
         </w:tc>
         <w:tc>
           <w:tcPr>
-            <w:tcW w:type="dxa" w:w="964"/>
+            <w:tcW w:type="dxa" w:w="7143"/>
+            <w:tcMar>
+              <w:top w:w="80" w:type="dxa"/>
+              <w:start w:w="90" w:type="dxa"/>
+              <w:bottom w:w="80" w:type="dxa"/>
+              <w:end w:w="90" w:type="dxa"/>
+            </w:tcMar>
+            <w:vAlign w:val="center"/>
+          </w:tcPr>
+          <w:p>
+            <w:pPr>
+              <w:spacing w:after="0"/>
+            </w:pPr>
+            <w:r>
+              <w:rPr>
+                <w:rFonts w:ascii="Times New Roman" w:hAnsi="Times New Roman"/>
+                <w:sz w:val="17"/>
+              </w:rPr>
+              <w:t>Выбрать и интерпретировать описательные статистики для данных с выбросом</w:t>
+            </w:r>
+          </w:p>
+        </w:tc>
+        <w:tc>
+          <w:tcPr>
+            <w:tcW w:type="dxa" w:w="1077"/>
+            <w:tcMar>
+              <w:top w:w="80" w:type="dxa"/>
+              <w:start w:w="90" w:type="dxa"/>
+              <w:bottom w:w="80" w:type="dxa"/>
+              <w:end w:w="90" w:type="dxa"/>
+            </w:tcMar>
+            <w:vAlign w:val="center"/>
+          </w:tcPr>
+          <w:p>
+            <w:pPr>
+              <w:spacing w:after="0"/>
+            </w:pPr>
+            <w:r>
+              <w:rPr>
+                <w:rFonts w:ascii="Times New Roman" w:hAnsi="Times New Roman"/>
+                <w:sz w:val="17"/>
+              </w:rPr>
+              <w:t>0–2</w:t>
+            </w:r>
+          </w:p>
+        </w:tc>
+      </w:tr>
+      <w:tr>
+        <w:tc>
+          <w:tcPr>
+            <w:tcW w:type="dxa" w:w="1247"/>
             <w:tcMar>
               <w:top w:w="80" w:type="dxa"/>
               <w:start w:w="90" w:type="dxa"/>
@@ -2387,113 +2411,13 @@
                 <w:rFonts w:ascii="Times New Roman" w:hAnsi="Times New Roman"/>
                 <w:sz w:val="17"/>
               </w:rPr>
-              <w:t>10</w:t>
-            </w:r>
-          </w:p>
-        </w:tc>
-      </w:tr>
-      <w:tr>
-        <w:tc>
-          <w:tcPr>
-            <w:tcW w:type="dxa" w:w="567"/>
-            <w:tcMar>
-              <w:top w:w="80" w:type="dxa"/>
-              <w:start w:w="90" w:type="dxa"/>
-              <w:bottom w:w="80" w:type="dxa"/>
-              <w:end w:w="90" w:type="dxa"/>
-            </w:tcMar>
-            <w:vAlign w:val="center"/>
-          </w:tcPr>
-          <w:p>
-            <w:pPr>
-              <w:spacing w:after="0"/>
-            </w:pPr>
-            <w:r>
-              <w:rPr>
-                <w:rFonts w:ascii="Times New Roman" w:hAnsi="Times New Roman"/>
-                <w:sz w:val="17"/>
-              </w:rPr>
-              <w:t>3</w:t>
+              <w:t>ВК-2.2</w:t>
             </w:r>
           </w:p>
         </w:tc>
         <w:tc>
           <w:tcPr>
-            <w:tcW w:type="dxa" w:w="2041"/>
-            <w:tcMar>
-              <w:top w:w="80" w:type="dxa"/>
-              <w:start w:w="90" w:type="dxa"/>
-              <w:bottom w:w="80" w:type="dxa"/>
-              <w:end w:w="90" w:type="dxa"/>
-            </w:tcMar>
-            <w:vAlign w:val="center"/>
-          </w:tcPr>
-          <w:p>
-            <w:pPr>
-              <w:spacing w:after="0"/>
-            </w:pPr>
-            <w:r>
-              <w:rPr>
-                <w:rFonts w:ascii="Times New Roman" w:hAnsi="Times New Roman"/>
-                <w:sz w:val="17"/>
-              </w:rPr>
-              <w:t>Статистика</w:t>
-            </w:r>
-          </w:p>
-        </w:tc>
-        <w:tc>
-          <w:tcPr>
-            <w:tcW w:type="dxa" w:w="5896"/>
-            <w:tcMar>
-              <w:top w:w="80" w:type="dxa"/>
-              <w:start w:w="90" w:type="dxa"/>
-              <w:bottom w:w="80" w:type="dxa"/>
-              <w:end w:w="90" w:type="dxa"/>
-            </w:tcMar>
-            <w:vAlign w:val="center"/>
-          </w:tcPr>
-          <w:p>
-            <w:pPr>
-              <w:spacing w:after="0"/>
-            </w:pPr>
-            <w:r>
-              <w:rPr>
-                <w:rFonts w:ascii="Times New Roman" w:hAnsi="Times New Roman"/>
-                <w:sz w:val="17"/>
-              </w:rPr>
-              <w:t>Выбрать среднее или медиану, интерпретировать разброс и корреляцию</w:t>
-            </w:r>
-          </w:p>
-        </w:tc>
-        <w:tc>
-          <w:tcPr>
-            <w:tcW w:type="dxa" w:w="964"/>
-            <w:tcMar>
-              <w:top w:w="80" w:type="dxa"/>
-              <w:start w:w="90" w:type="dxa"/>
-              <w:bottom w:w="80" w:type="dxa"/>
-              <w:end w:w="90" w:type="dxa"/>
-            </w:tcMar>
-            <w:vAlign w:val="center"/>
-          </w:tcPr>
-          <w:p>
-            <w:pPr>
-              <w:spacing w:after="0"/>
-            </w:pPr>
-            <w:r>
-              <w:rPr>
-                <w:rFonts w:ascii="Times New Roman" w:hAnsi="Times New Roman"/>
-                <w:sz w:val="17"/>
-              </w:rPr>
-              <w:t>15</w:t>
-            </w:r>
-          </w:p>
-        </w:tc>
-      </w:tr>
-      <w:tr>
-        <w:tc>
-          <w:tcPr>
-            <w:tcW w:type="dxa" w:w="567"/>
+            <w:tcW w:type="dxa" w:w="7143"/>
             <w:tcMar>
               <w:top w:w="80" w:type="dxa"/>
               <w:start w:w="90" w:type="dxa"/>
@@ -2512,13 +2436,13 @@
                 <w:rFonts w:ascii="Times New Roman" w:hAnsi="Times New Roman"/>
                 <w:sz w:val="17"/>
               </w:rPr>
-              <w:t>4</w:t>
+              <w:t>Интерпретировать корреляцию и назвать границы вывода</w:t>
             </w:r>
           </w:p>
         </w:tc>
         <w:tc>
           <w:tcPr>
-            <w:tcW w:type="dxa" w:w="2041"/>
+            <w:tcW w:type="dxa" w:w="1077"/>
             <w:tcMar>
               <w:top w:w="80" w:type="dxa"/>
               <w:start w:w="90" w:type="dxa"/>
@@ -2537,13 +2461,89 @@
                 <w:rFonts w:ascii="Times New Roman" w:hAnsi="Times New Roman"/>
                 <w:sz w:val="17"/>
               </w:rPr>
-              <w:t>Python</w:t>
+              <w:t>0–2</w:t>
+            </w:r>
+          </w:p>
+        </w:tc>
+      </w:tr>
+      <w:tr>
+        <w:tc>
+          <w:tcPr>
+            <w:tcW w:type="dxa" w:w="1247"/>
+            <w:tcMar>
+              <w:top w:w="80" w:type="dxa"/>
+              <w:start w:w="90" w:type="dxa"/>
+              <w:bottom w:w="80" w:type="dxa"/>
+              <w:end w:w="90" w:type="dxa"/>
+            </w:tcMar>
+            <w:vAlign w:val="center"/>
+          </w:tcPr>
+          <w:p>
+            <w:pPr>
+              <w:spacing w:after="0"/>
+            </w:pPr>
+            <w:r>
+              <w:rPr>
+                <w:rFonts w:ascii="Times New Roman" w:hAnsi="Times New Roman"/>
+                <w:sz w:val="17"/>
+              </w:rPr>
+              <w:t>ВК-3.1</w:t>
             </w:r>
           </w:p>
         </w:tc>
         <w:tc>
           <w:tcPr>
-            <w:tcW w:type="dxa" w:w="5896"/>
+            <w:tcW w:type="dxa" w:w="7143"/>
+            <w:tcMar>
+              <w:top w:w="80" w:type="dxa"/>
+              <w:start w:w="90" w:type="dxa"/>
+              <w:bottom w:w="80" w:type="dxa"/>
+              <w:end w:w="90" w:type="dxa"/>
+            </w:tcMar>
+            <w:vAlign w:val="center"/>
+          </w:tcPr>
+          <w:p>
+            <w:pPr>
+              <w:spacing w:after="0"/>
+            </w:pPr>
+            <w:r>
+              <w:rPr>
+                <w:rFonts w:ascii="Times New Roman" w:hAnsi="Times New Roman"/>
+                <w:sz w:val="17"/>
+              </w:rPr>
+              <w:t>Написать и проверить небольшую функцию Python</w:t>
+            </w:r>
+          </w:p>
+        </w:tc>
+        <w:tc>
+          <w:tcPr>
+            <w:tcW w:type="dxa" w:w="1077"/>
+            <w:tcMar>
+              <w:top w:w="80" w:type="dxa"/>
+              <w:start w:w="90" w:type="dxa"/>
+              <w:bottom w:w="80" w:type="dxa"/>
+              <w:end w:w="90" w:type="dxa"/>
+            </w:tcMar>
+            <w:vAlign w:val="center"/>
+          </w:tcPr>
+          <w:p>
+            <w:pPr>
+              <w:spacing w:after="0"/>
+            </w:pPr>
+            <w:r>
+              <w:rPr>
+                <w:rFonts w:ascii="Times New Roman" w:hAnsi="Times New Roman"/>
+                <w:sz w:val="17"/>
+              </w:rPr>
+              <w:t>0–2</w:t>
+            </w:r>
+          </w:p>
+        </w:tc>
+      </w:tr>
+      <w:tr>
+        <w:tc>
+          <w:tcPr>
+            <w:tcW w:type="dxa" w:w="1247"/>
             <w:tcMar>
               <w:top w:w="80" w:type="dxa"/>
               <w:start w:w="90" w:type="dxa"/>
@@ -2562,13 +2562,13 @@
                 <w:rFonts w:ascii="Times New Roman" w:hAnsi="Times New Roman"/>
                 <w:sz w:val="17"/>
               </w:rPr>
-              <w:t>Написать функцию обработки списка наблюдений и обработать ошибочный ввод</w:t>
+              <w:t>ВК-3.2</w:t>
             </w:r>
           </w:p>
         </w:tc>
         <w:tc>
           <w:tcPr>
-            <w:tcW w:type="dxa" w:w="964"/>
+            <w:tcW w:type="dxa" w:w="7143"/>
             <w:tcMar>
               <w:top w:w="80" w:type="dxa"/>
               <w:start w:w="90" w:type="dxa"/>
@@ -2587,113 +2587,13 @@
                 <w:rFonts w:ascii="Times New Roman" w:hAnsi="Times New Roman"/>
                 <w:sz w:val="17"/>
               </w:rPr>
-              <w:t>15</w:t>
-            </w:r>
-          </w:p>
-        </w:tc>
-      </w:tr>
-      <w:tr>
-        <w:tc>
-          <w:tcPr>
-            <w:tcW w:type="dxa" w:w="567"/>
-            <w:tcMar>
-              <w:top w:w="80" w:type="dxa"/>
-              <w:start w:w="90" w:type="dxa"/>
-              <w:bottom w:w="80" w:type="dxa"/>
-              <w:end w:w="90" w:type="dxa"/>
-            </w:tcMar>
-            <w:vAlign w:val="center"/>
-          </w:tcPr>
-          <w:p>
-            <w:pPr>
-              <w:spacing w:after="0"/>
-            </w:pPr>
-            <w:r>
-              <w:rPr>
-                <w:rFonts w:ascii="Times New Roman" w:hAnsi="Times New Roman"/>
-                <w:sz w:val="17"/>
-              </w:rPr>
-              <w:t>5</w:t>
+              <w:t>Исправить и повторно выполнить учебный ноутбук</w:t>
             </w:r>
           </w:p>
         </w:tc>
         <w:tc>
           <w:tcPr>
-            <w:tcW w:type="dxa" w:w="2041"/>
-            <w:tcMar>
-              <w:top w:w="80" w:type="dxa"/>
-              <w:start w:w="90" w:type="dxa"/>
-              <w:bottom w:w="80" w:type="dxa"/>
-              <w:end w:w="90" w:type="dxa"/>
-            </w:tcMar>
-            <w:vAlign w:val="center"/>
-          </w:tcPr>
-          <w:p>
-            <w:pPr>
-              <w:spacing w:after="0"/>
-            </w:pPr>
-            <w:r>
-              <w:rPr>
-                <w:rFonts w:ascii="Times New Roman" w:hAnsi="Times New Roman"/>
-                <w:sz w:val="17"/>
-              </w:rPr>
-              <w:t>Табличные данные</w:t>
-            </w:r>
-          </w:p>
-        </w:tc>
-        <w:tc>
-          <w:tcPr>
-            <w:tcW w:type="dxa" w:w="5896"/>
-            <w:tcMar>
-              <w:top w:w="80" w:type="dxa"/>
-              <w:start w:w="90" w:type="dxa"/>
-              <w:bottom w:w="80" w:type="dxa"/>
-              <w:end w:w="90" w:type="dxa"/>
-            </w:tcMar>
-            <w:vAlign w:val="center"/>
-          </w:tcPr>
-          <w:p>
-            <w:pPr>
-              <w:spacing w:after="0"/>
-            </w:pPr>
-            <w:r>
-              <w:rPr>
-                <w:rFonts w:ascii="Times New Roman" w:hAnsi="Times New Roman"/>
-                <w:sz w:val="17"/>
-              </w:rPr>
-              <w:t>Загрузить файл, отфильтровать строки, получить групповые показатели</w:t>
-            </w:r>
-          </w:p>
-        </w:tc>
-        <w:tc>
-          <w:tcPr>
-            <w:tcW w:type="dxa" w:w="964"/>
-            <w:tcMar>
-              <w:top w:w="80" w:type="dxa"/>
-              <w:start w:w="90" w:type="dxa"/>
-              <w:bottom w:w="80" w:type="dxa"/>
-              <w:end w:w="90" w:type="dxa"/>
-            </w:tcMar>
-            <w:vAlign w:val="center"/>
-          </w:tcPr>
-          <w:p>
-            <w:pPr>
-              <w:spacing w:after="0"/>
-            </w:pPr>
-            <w:r>
-              <w:rPr>
-                <w:rFonts w:ascii="Times New Roman" w:hAnsi="Times New Roman"/>
-                <w:sz w:val="17"/>
-              </w:rPr>
-              <w:t>15</w:t>
-            </w:r>
-          </w:p>
-        </w:tc>
-      </w:tr>
-      <w:tr>
-        <w:tc>
-          <w:tcPr>
-            <w:tcW w:type="dxa" w:w="567"/>
+            <w:tcW w:type="dxa" w:w="1077"/>
             <w:tcMar>
               <w:top w:w="80" w:type="dxa"/>
               <w:start w:w="90" w:type="dxa"/>
@@ -2712,13 +2612,89 @@
                 <w:rFonts w:ascii="Times New Roman" w:hAnsi="Times New Roman"/>
                 <w:sz w:val="17"/>
               </w:rPr>
-              <w:t>6</w:t>
+              <w:t>0–2</w:t>
+            </w:r>
+          </w:p>
+        </w:tc>
+      </w:tr>
+      <w:tr>
+        <w:tc>
+          <w:tcPr>
+            <w:tcW w:type="dxa" w:w="1247"/>
+            <w:tcMar>
+              <w:top w:w="80" w:type="dxa"/>
+              <w:start w:w="90" w:type="dxa"/>
+              <w:bottom w:w="80" w:type="dxa"/>
+              <w:end w:w="90" w:type="dxa"/>
+            </w:tcMar>
+            <w:vAlign w:val="center"/>
+          </w:tcPr>
+          <w:p>
+            <w:pPr>
+              <w:spacing w:after="0"/>
+            </w:pPr>
+            <w:r>
+              <w:rPr>
+                <w:rFonts w:ascii="Times New Roman" w:hAnsi="Times New Roman"/>
+                <w:sz w:val="17"/>
+              </w:rPr>
+              <w:t>ВК-4.1</w:t>
             </w:r>
           </w:p>
         </w:tc>
         <w:tc>
           <w:tcPr>
-            <w:tcW w:type="dxa" w:w="2041"/>
+            <w:tcW w:type="dxa" w:w="7143"/>
+            <w:tcMar>
+              <w:top w:w="80" w:type="dxa"/>
+              <w:start w:w="90" w:type="dxa"/>
+              <w:bottom w:w="80" w:type="dxa"/>
+              <w:end w:w="90" w:type="dxa"/>
+            </w:tcMar>
+            <w:vAlign w:val="center"/>
+          </w:tcPr>
+          <w:p>
+            <w:pPr>
+              <w:spacing w:after="0"/>
+            </w:pPr>
+            <w:r>
+              <w:rPr>
+                <w:rFonts w:ascii="Times New Roman" w:hAnsi="Times New Roman"/>
+                <w:sz w:val="17"/>
+              </w:rPr>
+              <w:t>Объединить таблицы и получить групповые показатели</w:t>
+            </w:r>
+          </w:p>
+        </w:tc>
+        <w:tc>
+          <w:tcPr>
+            <w:tcW w:type="dxa" w:w="1077"/>
+            <w:tcMar>
+              <w:top w:w="80" w:type="dxa"/>
+              <w:start w:w="90" w:type="dxa"/>
+              <w:bottom w:w="80" w:type="dxa"/>
+              <w:end w:w="90" w:type="dxa"/>
+            </w:tcMar>
+            <w:vAlign w:val="center"/>
+          </w:tcPr>
+          <w:p>
+            <w:pPr>
+              <w:spacing w:after="0"/>
+            </w:pPr>
+            <w:r>
+              <w:rPr>
+                <w:rFonts w:ascii="Times New Roman" w:hAnsi="Times New Roman"/>
+                <w:sz w:val="17"/>
+              </w:rPr>
+              <w:t>0–2</w:t>
+            </w:r>
+          </w:p>
+        </w:tc>
+      </w:tr>
+      <w:tr>
+        <w:tc>
+          <w:tcPr>
+            <w:tcW w:type="dxa" w:w="1247"/>
             <w:tcMar>
               <w:top w:w="80" w:type="dxa"/>
               <w:start w:w="90" w:type="dxa"/>
@@ -2737,13 +2713,13 @@
                 <w:rFonts w:ascii="Times New Roman" w:hAnsi="Times New Roman"/>
                 <w:sz w:val="17"/>
               </w:rPr>
-              <w:t>SQL</w:t>
+              <w:t>ВК-4.2</w:t>
             </w:r>
           </w:p>
         </w:tc>
         <w:tc>
           <w:tcPr>
-            <w:tcW w:type="dxa" w:w="5896"/>
+            <w:tcW w:type="dxa" w:w="7143"/>
             <w:tcMar>
               <w:top w:w="80" w:type="dxa"/>
               <w:start w:w="90" w:type="dxa"/>
@@ -2762,13 +2738,13 @@
                 <w:rFonts w:ascii="Times New Roman" w:hAnsi="Times New Roman"/>
                 <w:sz w:val="17"/>
               </w:rPr>
-              <w:t>Составить запрос с JOIN и GROUP BY либо объяснить готовый запрос</w:t>
+              <w:t>Составить запрос с JOIN и GROUP BY и описать происхождение результата</w:t>
             </w:r>
           </w:p>
         </w:tc>
         <w:tc>
           <w:tcPr>
-            <w:tcW w:type="dxa" w:w="964"/>
+            <w:tcW w:type="dxa" w:w="1077"/>
             <w:tcMar>
               <w:top w:w="80" w:type="dxa"/>
               <w:start w:w="90" w:type="dxa"/>
@@ -2787,207 +2763,7 @@
                 <w:rFonts w:ascii="Times New Roman" w:hAnsi="Times New Roman"/>
                 <w:sz w:val="17"/>
               </w:rPr>
-              <w:t>10</w:t>
-            </w:r>
-          </w:p>
-        </w:tc>
-      </w:tr>
-      <w:tr>
-        <w:tc>
-          <w:tcPr>
-            <w:tcW w:type="dxa" w:w="567"/>
-            <w:tcMar>
-              <w:top w:w="80" w:type="dxa"/>
-              <w:start w:w="90" w:type="dxa"/>
-              <w:bottom w:w="80" w:type="dxa"/>
-              <w:end w:w="90" w:type="dxa"/>
-            </w:tcMar>
-            <w:vAlign w:val="center"/>
-          </w:tcPr>
-          <w:p>
-            <w:pPr>
-              <w:spacing w:after="0"/>
-            </w:pPr>
-            <w:r>
-              <w:rPr>
-                <w:rFonts w:ascii="Times New Roman" w:hAnsi="Times New Roman"/>
-                <w:sz w:val="17"/>
-              </w:rPr>
-              <w:t>7</w:t>
-            </w:r>
-          </w:p>
-        </w:tc>
-        <w:tc>
-          <w:tcPr>
-            <w:tcW w:type="dxa" w:w="2041"/>
-            <w:tcMar>
-              <w:top w:w="80" w:type="dxa"/>
-              <w:start w:w="90" w:type="dxa"/>
-              <w:bottom w:w="80" w:type="dxa"/>
-              <w:end w:w="90" w:type="dxa"/>
-            </w:tcMar>
-            <w:vAlign w:val="center"/>
-          </w:tcPr>
-          <w:p>
-            <w:pPr>
-              <w:spacing w:after="0"/>
-            </w:pPr>
-            <w:r>
-              <w:rPr>
-                <w:rFonts w:ascii="Times New Roman" w:hAnsi="Times New Roman"/>
-                <w:sz w:val="17"/>
-              </w:rPr>
-              <w:t>Качество данных</w:t>
-            </w:r>
-          </w:p>
-        </w:tc>
-        <w:tc>
-          <w:tcPr>
-            <w:tcW w:type="dxa" w:w="5896"/>
-            <w:tcMar>
-              <w:top w:w="80" w:type="dxa"/>
-              <w:start w:w="90" w:type="dxa"/>
-              <w:bottom w:w="80" w:type="dxa"/>
-              <w:end w:w="90" w:type="dxa"/>
-            </w:tcMar>
-            <w:vAlign w:val="center"/>
-          </w:tcPr>
-          <w:p>
-            <w:pPr>
-              <w:spacing w:after="0"/>
-            </w:pPr>
-            <w:r>
-              <w:rPr>
-                <w:rFonts w:ascii="Times New Roman" w:hAnsi="Times New Roman"/>
-                <w:sz w:val="17"/>
-              </w:rPr>
-              <w:t>Найти пропуски, дубликаты, неверные типы и потенциальную утечку</w:t>
-            </w:r>
-          </w:p>
-        </w:tc>
-        <w:tc>
-          <w:tcPr>
-            <w:tcW w:type="dxa" w:w="964"/>
-            <w:tcMar>
-              <w:top w:w="80" w:type="dxa"/>
-              <w:start w:w="90" w:type="dxa"/>
-              <w:bottom w:w="80" w:type="dxa"/>
-              <w:end w:w="90" w:type="dxa"/>
-            </w:tcMar>
-            <w:vAlign w:val="center"/>
-          </w:tcPr>
-          <w:p>
-            <w:pPr>
-              <w:spacing w:after="0"/>
-            </w:pPr>
-            <w:r>
-              <w:rPr>
-                <w:rFonts w:ascii="Times New Roman" w:hAnsi="Times New Roman"/>
-                <w:sz w:val="17"/>
-              </w:rPr>
-              <w:t>15</w:t>
-            </w:r>
-          </w:p>
-        </w:tc>
-      </w:tr>
-      <w:tr>
-        <w:tc>
-          <w:tcPr>
-            <w:tcW w:type="dxa" w:w="567"/>
-            <w:tcMar>
-              <w:top w:w="80" w:type="dxa"/>
-              <w:start w:w="90" w:type="dxa"/>
-              <w:bottom w:w="80" w:type="dxa"/>
-              <w:end w:w="90" w:type="dxa"/>
-            </w:tcMar>
-            <w:vAlign w:val="center"/>
-            <w:shd w:fill="F7FAFC"/>
-          </w:tcPr>
-          <w:p>
-            <w:pPr>
-              <w:spacing w:after="0"/>
-            </w:pPr>
-            <w:r>
-              <w:rPr>
-                <w:rFonts w:ascii="Times New Roman" w:hAnsi="Times New Roman"/>
-                <w:sz w:val="17"/>
-              </w:rPr>
-              <w:t>8</w:t>
-            </w:r>
-          </w:p>
-        </w:tc>
-        <w:tc>
-          <w:tcPr>
-            <w:tcW w:type="dxa" w:w="2041"/>
-            <w:tcMar>
-              <w:top w:w="80" w:type="dxa"/>
-              <w:start w:w="90" w:type="dxa"/>
-              <w:bottom w:w="80" w:type="dxa"/>
-              <w:end w:w="90" w:type="dxa"/>
-            </w:tcMar>
-            <w:vAlign w:val="center"/>
-            <w:shd w:fill="F7FAFC"/>
-          </w:tcPr>
-          <w:p>
-            <w:pPr>
-              <w:spacing w:after="0"/>
-            </w:pPr>
-            <w:r>
-              <w:rPr>
-                <w:rFonts w:ascii="Times New Roman" w:hAnsi="Times New Roman"/>
-                <w:sz w:val="17"/>
-              </w:rPr>
-              <w:t>Постановка задачи</w:t>
-            </w:r>
-          </w:p>
-        </w:tc>
-        <w:tc>
-          <w:tcPr>
-            <w:tcW w:type="dxa" w:w="5896"/>
-            <w:tcMar>
-              <w:top w:w="80" w:type="dxa"/>
-              <w:start w:w="90" w:type="dxa"/>
-              <w:bottom w:w="80" w:type="dxa"/>
-              <w:end w:w="90" w:type="dxa"/>
-            </w:tcMar>
-            <w:vAlign w:val="center"/>
-            <w:shd w:fill="F7FAFC"/>
-          </w:tcPr>
-          <w:p>
-            <w:pPr>
-              <w:spacing w:after="0"/>
-            </w:pPr>
-            <w:r>
-              <w:rPr>
-                <w:rFonts w:ascii="Times New Roman" w:hAnsi="Times New Roman"/>
-                <w:sz w:val="17"/>
-              </w:rPr>
-              <w:t>Отличить предметную проблему, аналитическую задачу и метрику модели</w:t>
-            </w:r>
-          </w:p>
-        </w:tc>
-        <w:tc>
-          <w:tcPr>
-            <w:tcW w:type="dxa" w:w="964"/>
-            <w:tcMar>
-              <w:top w:w="80" w:type="dxa"/>
-              <w:start w:w="90" w:type="dxa"/>
-              <w:bottom w:w="80" w:type="dxa"/>
-              <w:end w:w="90" w:type="dxa"/>
-            </w:tcMar>
-            <w:vAlign w:val="center"/>
-            <w:shd w:fill="F7FAFC"/>
-          </w:tcPr>
-          <w:p>
-            <w:pPr>
-              <w:spacing w:after="0"/>
-            </w:pPr>
-            <w:r>
-              <w:rPr>
-                <w:rFonts w:ascii="Times New Roman" w:hAnsi="Times New Roman"/>
-                <w:sz w:val="17"/>
-              </w:rPr>
-              <w:t>10</w:t>
+              <w:t>0–2</w:t>
             </w:r>
           </w:p>
         </w:tc>
@@ -3003,7 +2779,7 @@
         <w:pStyle w:val="ListBullet"/>
       </w:pPr>
       <w:r>
-        <w:t>70–100 баллов — студент готов к прохождению дисциплины без дополнительной подготовки.</w:t>
+        <w:t>2 балла — умение проявляется уверенно.</w:t>
       </w:r>
     </w:p>
     <w:p>
@@ -3011,7 +2787,7 @@
         <w:pStyle w:val="ListBullet"/>
       </w:pPr>
       <w:r>
-        <w:t>40–69 баллов — допускается к курсу с обязательным выполнением индивидуального выравнивающего маршрута.</w:t>
+        <w:t>1 балл — базовый уровень достигнут.</w:t>
       </w:r>
     </w:p>
     <w:p>
@@ -3019,7 +2795,15 @@
         <w:pStyle w:val="ListBullet"/>
       </w:pPr>
       <w:r>
-        <w:t>0–39 баллов — рекомендуется предварительный интенсив либо отдельный выравнивающий модуль.</w:t>
+        <w:t>0 баллов — назначается материал для повторения и повторная проверка только этого индикатора.</w:t>
+      </w:r>
+    </w:p>
+    <w:p>
+      <w:pPr>
+        <w:pStyle w:val="ListBullet"/>
+      </w:pPr>
+      <w:r>
+        <w:t>Сильный результат по одному индикатору не компенсирует отсутствие другого.</w:t>
       </w:r>
     </w:p>
     <w:p>

</xml_diff>